<commit_message>
feat: main app, inf-Cloud, Doc the entire application, infrastructure cloud Documentation requried Diagrams
</commit_message>
<xml_diff>
--- a/ePayco_Arquitectura_Final.docx
+++ b/ePayco_Arquitectura_Final.docx
@@ -6,8 +6,6 @@
       <w:pPr>
         <w:pStyle w:val="2"/>
       </w:pPr>
-      <w:bookmarkStart w:id="45" w:name="_GoBack"/>
-      <w:bookmarkEnd w:id="45"/>
       <w:bookmarkStart w:id="0" w:name="_Toc1610753324"/>
       <w:bookmarkStart w:id="1" w:name="X4b884dd1e8bdd7929451a1517081a89c6abe107"/>
       <w:r>
@@ -5635,7 +5633,17 @@
         <w:t>Compliance &amp; Standards:</w:t>
       </w:r>
       <w:r>
-        <w:t xml:space="preserve"> - PCI DSS Level 1 - GDPR (right to be forgotten) - AML (Anti-Money Laundering) - SOX (Sarbanes-Oxley, if public)</w:t>
+        <w:t xml:space="preserve"> - PCI DSS Level 1 - GDPR (</w:t>
+      </w:r>
+      <w:r>
+        <w:rPr>
+          <w:rFonts w:hint="default"/>
+          <w:lang w:val="en-US"/>
+        </w:rPr>
+        <w:t>Derecho al olvido</w:t>
+      </w:r>
+      <w:r>
+        <w:t>) - AML (Anti-Money Laundering)</w:t>
       </w:r>
     </w:p>
     <w:p/>
@@ -5679,19 +5687,8 @@
       <w:r>
         <w:t xml:space="preserve"> Aprobado para Implementación Fase 1</w:t>
       </w:r>
-      <w:r>
-        <w:br w:type="textWrapping"/>
-      </w:r>
-      <w:r>
-        <w:rPr>
-          <w:b/>
-          <w:bCs/>
-        </w:rPr>
-        <w:t>Próxima Revisión:</w:t>
-      </w:r>
-      <w:r>
-        <w:t xml:space="preserve"> Enero 2026 (post Fase 1)</w:t>
-      </w:r>
+      <w:bookmarkStart w:id="45" w:name="_GoBack"/>
+      <w:bookmarkEnd w:id="45"/>
     </w:p>
     <w:bookmarkEnd w:id="1"/>
     <w:bookmarkEnd w:id="44"/>
@@ -6019,7 +6016,7 @@
     </w:pPr>
     <w:rPr>
       <w:rFonts w:asciiTheme="majorHAnsi" w:hAnsiTheme="majorHAnsi" w:eastAsiaTheme="majorEastAsia" w:cstheme="majorBidi"/>
-      <w:color w:val="0F4761" w:themeColor="accent1" w:themeShade="BF"/>
+      <w:color w:val="104862" w:themeColor="accent1" w:themeShade="BF"/>
       <w:sz w:val="40"/>
       <w:szCs w:val="40"/>
     </w:rPr>
@@ -6041,7 +6038,7 @@
     </w:pPr>
     <w:rPr>
       <w:rFonts w:asciiTheme="majorHAnsi" w:hAnsiTheme="majorHAnsi" w:eastAsiaTheme="majorEastAsia" w:cstheme="majorBidi"/>
-      <w:color w:val="0F4761" w:themeColor="accent1" w:themeShade="BF"/>
+      <w:color w:val="104862" w:themeColor="accent1" w:themeShade="BF"/>
       <w:sz w:val="32"/>
       <w:szCs w:val="32"/>
     </w:rPr>
@@ -6063,7 +6060,7 @@
     </w:pPr>
     <w:rPr>
       <w:rFonts w:eastAsiaTheme="majorEastAsia" w:cstheme="majorBidi"/>
-      <w:color w:val="0F4761" w:themeColor="accent1" w:themeShade="BF"/>
+      <w:color w:val="104862" w:themeColor="accent1" w:themeShade="BF"/>
       <w:sz w:val="28"/>
       <w:szCs w:val="28"/>
     </w:rPr>
@@ -6087,7 +6084,7 @@
       <w:rFonts w:eastAsiaTheme="majorEastAsia" w:cstheme="majorBidi"/>
       <w:i/>
       <w:iCs/>
-      <w:color w:val="0F4761" w:themeColor="accent1" w:themeShade="BF"/>
+      <w:color w:val="104862" w:themeColor="accent1" w:themeShade="BF"/>
     </w:rPr>
   </w:style>
   <w:style w:type="paragraph" w:styleId="7">
@@ -6107,7 +6104,7 @@
     </w:pPr>
     <w:rPr>
       <w:rFonts w:eastAsiaTheme="majorEastAsia" w:cstheme="majorBidi"/>
-      <w:color w:val="0F4761" w:themeColor="accent1" w:themeShade="BF"/>
+      <w:color w:val="104862" w:themeColor="accent1" w:themeShade="BF"/>
     </w:rPr>
   </w:style>
   <w:style w:type="paragraph" w:styleId="8">
@@ -6129,7 +6126,15 @@
       <w:rFonts w:eastAsiaTheme="majorEastAsia" w:cstheme="majorBidi"/>
       <w:i/>
       <w:iCs/>
-      <w:color w:val="585858" w:themeColor="text1" w:themeTint="A6"/>
+      <w:color w:val="595959" w:themeColor="text1" w:themeTint="A6"/>
+      <w14:textFill>
+        <w14:solidFill>
+          <w14:schemeClr w14:val="tx1">
+            <w14:lumMod w14:val="65000"/>
+            <w14:lumOff w14:val="35000"/>
+          </w14:schemeClr>
+        </w14:solidFill>
+      </w14:textFill>
     </w:rPr>
   </w:style>
   <w:style w:type="paragraph" w:styleId="9">
@@ -6149,7 +6154,15 @@
     </w:pPr>
     <w:rPr>
       <w:rFonts w:eastAsiaTheme="majorEastAsia" w:cstheme="majorBidi"/>
-      <w:color w:val="585858" w:themeColor="text1" w:themeTint="A6"/>
+      <w:color w:val="595959" w:themeColor="text1" w:themeTint="A6"/>
+      <w14:textFill>
+        <w14:solidFill>
+          <w14:schemeClr w14:val="tx1">
+            <w14:lumMod w14:val="65000"/>
+            <w14:lumOff w14:val="35000"/>
+          </w14:schemeClr>
+        </w14:solidFill>
+      </w14:textFill>
     </w:rPr>
   </w:style>
   <w:style w:type="paragraph" w:styleId="10">
@@ -6171,7 +6184,15 @@
       <w:rFonts w:eastAsiaTheme="majorEastAsia" w:cstheme="majorBidi"/>
       <w:i/>
       <w:iCs/>
-      <w:color w:val="262626" w:themeColor="text1" w:themeTint="D8"/>
+      <w:color w:val="262626" w:themeColor="text1" w:themeTint="D9"/>
+      <w14:textFill>
+        <w14:solidFill>
+          <w14:schemeClr w14:val="tx1">
+            <w14:lumMod w14:val="85000"/>
+            <w14:lumOff w14:val="15000"/>
+          </w14:schemeClr>
+        </w14:solidFill>
+      </w14:textFill>
     </w:rPr>
   </w:style>
   <w:style w:type="paragraph" w:styleId="11">
@@ -6191,7 +6212,15 @@
     </w:pPr>
     <w:rPr>
       <w:rFonts w:eastAsiaTheme="majorEastAsia" w:cstheme="majorBidi"/>
-      <w:color w:val="262626" w:themeColor="text1" w:themeTint="D8"/>
+      <w:color w:val="262626" w:themeColor="text1" w:themeTint="D9"/>
+      <w14:textFill>
+        <w14:solidFill>
+          <w14:schemeClr w14:val="tx1">
+            <w14:lumMod w14:val="85000"/>
+            <w14:lumOff w14:val="15000"/>
+          </w14:schemeClr>
+        </w14:solidFill>
+      </w14:textFill>
     </w:rPr>
   </w:style>
   <w:style w:type="character" w:default="1" w:styleId="12">
@@ -6305,6 +6334,11 @@
     <w:uiPriority w:val="0"/>
     <w:rPr>
       <w:color w:val="156082" w:themeColor="accent1"/>
+      <w14:textFill>
+        <w14:solidFill>
+          <w14:schemeClr w14:val="accent1"/>
+        </w14:solidFill>
+      </w14:textFill>
     </w:rPr>
   </w:style>
   <w:style w:type="paragraph" w:styleId="22">
@@ -6355,10 +6389,18 @@
     <w:uiPriority w:val="11"/>
     <w:rPr>
       <w:rFonts w:eastAsiaTheme="majorEastAsia" w:cstheme="majorBidi"/>
-      <w:color w:val="585858" w:themeColor="text1" w:themeTint="A6"/>
+      <w:color w:val="595959" w:themeColor="text1" w:themeTint="A6"/>
       <w:spacing w:val="15"/>
       <w:sz w:val="28"/>
       <w:szCs w:val="28"/>
+      <w14:textFill>
+        <w14:solidFill>
+          <w14:schemeClr w14:val="tx1">
+            <w14:lumMod w14:val="65000"/>
+            <w14:lumOff w14:val="35000"/>
+          </w14:schemeClr>
+        </w14:solidFill>
+      </w14:textFill>
     </w:rPr>
   </w:style>
   <w:style w:type="paragraph" w:customStyle="1" w:styleId="27">
@@ -6423,7 +6465,7 @@
     <w:uiPriority w:val="9"/>
     <w:rPr>
       <w:rFonts w:asciiTheme="majorHAnsi" w:hAnsiTheme="majorHAnsi" w:eastAsiaTheme="majorEastAsia" w:cstheme="majorBidi"/>
-      <w:color w:val="0F4761" w:themeColor="accent1" w:themeShade="BF"/>
+      <w:color w:val="104862" w:themeColor="accent1" w:themeShade="BF"/>
       <w:sz w:val="40"/>
       <w:szCs w:val="40"/>
     </w:rPr>
@@ -6436,7 +6478,7 @@
     <w:uiPriority w:val="9"/>
     <w:rPr>
       <w:rFonts w:asciiTheme="majorHAnsi" w:hAnsiTheme="majorHAnsi" w:eastAsiaTheme="majorEastAsia" w:cstheme="majorBidi"/>
-      <w:color w:val="0F4761" w:themeColor="accent1" w:themeShade="BF"/>
+      <w:color w:val="104862" w:themeColor="accent1" w:themeShade="BF"/>
       <w:sz w:val="32"/>
       <w:szCs w:val="32"/>
     </w:rPr>
@@ -6449,7 +6491,7 @@
     <w:uiPriority w:val="9"/>
     <w:rPr>
       <w:rFonts w:eastAsiaTheme="majorEastAsia" w:cstheme="majorBidi"/>
-      <w:color w:val="0F4761" w:themeColor="accent1" w:themeShade="BF"/>
+      <w:color w:val="104862" w:themeColor="accent1" w:themeShade="BF"/>
       <w:sz w:val="28"/>
       <w:szCs w:val="28"/>
     </w:rPr>
@@ -6464,7 +6506,7 @@
       <w:rFonts w:eastAsiaTheme="majorEastAsia" w:cstheme="majorBidi"/>
       <w:i/>
       <w:iCs/>
-      <w:color w:val="0F4761" w:themeColor="accent1" w:themeShade="BF"/>
+      <w:color w:val="104862" w:themeColor="accent1" w:themeShade="BF"/>
     </w:rPr>
   </w:style>
   <w:style w:type="character" w:customStyle="1" w:styleId="35">
@@ -6475,7 +6517,7 @@
     <w:uiPriority w:val="9"/>
     <w:rPr>
       <w:rFonts w:eastAsiaTheme="majorEastAsia" w:cstheme="majorBidi"/>
-      <w:color w:val="0F4761" w:themeColor="accent1" w:themeShade="BF"/>
+      <w:color w:val="104862" w:themeColor="accent1" w:themeShade="BF"/>
     </w:rPr>
   </w:style>
   <w:style w:type="character" w:customStyle="1" w:styleId="36">
@@ -6488,7 +6530,15 @@
       <w:rFonts w:eastAsiaTheme="majorEastAsia" w:cstheme="majorBidi"/>
       <w:i/>
       <w:iCs/>
-      <w:color w:val="585858" w:themeColor="text1" w:themeTint="A6"/>
+      <w:color w:val="595959" w:themeColor="text1" w:themeTint="A6"/>
+      <w14:textFill>
+        <w14:solidFill>
+          <w14:schemeClr w14:val="tx1">
+            <w14:lumMod w14:val="65000"/>
+            <w14:lumOff w14:val="35000"/>
+          </w14:schemeClr>
+        </w14:solidFill>
+      </w14:textFill>
     </w:rPr>
   </w:style>
   <w:style w:type="character" w:customStyle="1" w:styleId="37">
@@ -6499,7 +6549,15 @@
     <w:uiPriority w:val="9"/>
     <w:rPr>
       <w:rFonts w:eastAsiaTheme="majorEastAsia" w:cstheme="majorBidi"/>
-      <w:color w:val="585858" w:themeColor="text1" w:themeTint="A6"/>
+      <w:color w:val="595959" w:themeColor="text1" w:themeTint="A6"/>
+      <w14:textFill>
+        <w14:solidFill>
+          <w14:schemeClr w14:val="tx1">
+            <w14:lumMod w14:val="65000"/>
+            <w14:lumOff w14:val="35000"/>
+          </w14:schemeClr>
+        </w14:solidFill>
+      </w14:textFill>
     </w:rPr>
   </w:style>
   <w:style w:type="character" w:customStyle="1" w:styleId="38">
@@ -6512,7 +6570,15 @@
       <w:rFonts w:eastAsiaTheme="majorEastAsia" w:cstheme="majorBidi"/>
       <w:i/>
       <w:iCs/>
-      <w:color w:val="262626" w:themeColor="text1" w:themeTint="D8"/>
+      <w:color w:val="262626" w:themeColor="text1" w:themeTint="D9"/>
+      <w14:textFill>
+        <w14:solidFill>
+          <w14:schemeClr w14:val="tx1">
+            <w14:lumMod w14:val="85000"/>
+            <w14:lumOff w14:val="15000"/>
+          </w14:schemeClr>
+        </w14:solidFill>
+      </w14:textFill>
     </w:rPr>
   </w:style>
   <w:style w:type="character" w:customStyle="1" w:styleId="39">
@@ -6523,7 +6589,15 @@
     <w:uiPriority w:val="9"/>
     <w:rPr>
       <w:rFonts w:eastAsiaTheme="majorEastAsia" w:cstheme="majorBidi"/>
-      <w:color w:val="262626" w:themeColor="text1" w:themeTint="D8"/>
+      <w:color w:val="262626" w:themeColor="text1" w:themeTint="D9"/>
+      <w14:textFill>
+        <w14:solidFill>
+          <w14:schemeClr w14:val="tx1">
+            <w14:lumMod w14:val="85000"/>
+            <w14:lumOff w14:val="15000"/>
+          </w14:schemeClr>
+        </w14:solidFill>
+      </w14:textFill>
     </w:rPr>
   </w:style>
   <w:style w:type="paragraph" w:customStyle="1" w:styleId="40">
@@ -6643,7 +6717,7 @@
     </w:pPr>
     <w:rPr>
       <w:rFonts w:asciiTheme="majorHAnsi" w:hAnsiTheme="majorHAnsi" w:eastAsiaTheme="majorEastAsia" w:cstheme="majorBidi"/>
-      <w:color w:val="0F4761" w:themeColor="accent1" w:themeShade="BF"/>
+      <w:color w:val="104862" w:themeColor="accent1" w:themeShade="BF"/>
     </w:rPr>
   </w:style>
   <w:style w:type="character" w:customStyle="1" w:styleId="52">

</xml_diff>